<commit_message>
Integration SOW V4: governance, LLM placeholders, tables, preview sync
</commit_message>
<xml_diff>
--- a/Template/CoreAssess_Template.docx
+++ b/Template/CoreAssess_Template.docx
@@ -12036,14 +12036,68 @@
           <w:szCs w:val="36"/>
         </w:rPr>
         <w:lastRenderedPageBreak/>
-        <w:t>Pro</w:t>
-      </w:r>
-      <w:r>
-        <w:rPr>
+        <w:t>Solution</w:t>
+      </w:r>
+    </w:p>
+    <w:p>
+      <w:pPr>
+        <w:autoSpaceDE w:val="0"/>
+        <w:autoSpaceDN w:val="0"/>
+        <w:adjustRightInd w:val="0"/>
+        <w:rPr>
+          <w:rFonts w:ascii="Arial" w:hAnsi="Arial" w:cs="Arial"/>
+        </w:rPr>
+      </w:pPr>
+      <w:r>
+        <w:rPr>
+          <w:rFonts w:ascii="Arial" w:hAnsi="Arial" w:cs="Arial"/>
+        </w:rPr>
+        <w:t>&lt;SOLUTION</w:t>
+      </w:r>
+      <w:r>
+        <w:rPr>
+          <w:rFonts w:ascii="Arial" w:hAnsi="Arial" w:cs="Arial"/>
+        </w:rPr>
+        <w:t>&gt;</w:t>
+      </w:r>
+    </w:p>
+    <w:p>
+      <w:pPr>
+        <w:rPr>
+          <w:rFonts w:ascii="Arial" w:eastAsia="Arial" w:hAnsi="Arial" w:cs="Arial"/>
+          <w:b/>
+          <w:bCs/>
+          <w:snapToGrid w:val="0"/>
+          <w:color w:val="E36C0A" w:themeColor="accent6" w:themeShade="BF"/>
+          <w:kern w:val="32"/>
           <w:sz w:val="36"/>
           <w:szCs w:val="36"/>
-        </w:rPr>
-        <w:t xml:space="preserve">posed Solution </w:t>
+          <w:lang w:val="en-GB" w:eastAsia="en-US"/>
+        </w:rPr>
+      </w:pPr>
+    </w:p>
+    <w:p>
+      <w:pPr>
+        <w:rPr>
+          <w:lang w:val="en-GB" w:eastAsia="en-US"/>
+        </w:rPr>
+      </w:pPr>
+    </w:p>
+    <w:p>
+      <w:pPr>
+        <w:pStyle w:val="Heading1"/>
+        <w:rPr>
+          <w:sz w:val="36"/>
+          <w:szCs w:val="36"/>
+        </w:rPr>
+      </w:pPr>
+      <w:r>
+        <w:rPr>
+          <w:sz w:val="36"/>
+          <w:szCs w:val="36"/>
+        </w:rPr>
+        <w:lastRenderedPageBreak/>
+        <w:t xml:space="preserve">Project </w:t>
       </w:r>
       <w:r>
         <w:rPr>
@@ -21578,7 +21632,7 @@
   <w:style w:type="paragraph" w:default="1" w:styleId="Normal">
     <w:name w:val="Normal"/>
     <w:qFormat/>
-    <w:rsid w:val="002127E5"/>
+    <w:rsid w:val="006F3FC8"/>
     <w:rPr>
       <w:sz w:val="24"/>
       <w:szCs w:val="24"/>
@@ -25350,6 +25404,19 @@
 </file>
 
 <file path=customXml/item2.xml><?xml version="1.0" encoding="utf-8"?>
+<p:properties xmlns:p="http://schemas.microsoft.com/office/2006/metadata/properties" xmlns:xsi="http://www.w3.org/2001/XMLSchema-instance">
+  <documentManagement>
+    <Comments xmlns="2dd6ba2a-3947-4223-b8a9-da90adf2cba5" xsi:nil="true"/>
+    <lcf76f155ced4ddcb4097134ff3c332f xmlns="2dd6ba2a-3947-4223-b8a9-da90adf2cba5">
+      <Terms xmlns="http://schemas.microsoft.com/office/infopath/2007/PartnerControls"/>
+    </lcf76f155ced4ddcb4097134ff3c332f>
+    <_Flow_SignoffStatus xmlns="2dd6ba2a-3947-4223-b8a9-da90adf2cba5" xsi:nil="true"/>
+    <TaxCatchAll xmlns="20b13389-1085-4401-9aca-e940c1900e8d" xsi:nil="true"/>
+  </documentManagement>
+</p:properties>
+</file>
+
+<file path=customXml/item3.xml><?xml version="1.0" encoding="utf-8"?>
 <ct:contentTypeSchema xmlns:ct="http://schemas.microsoft.com/office/2006/metadata/contentType" xmlns:ma="http://schemas.microsoft.com/office/2006/metadata/properties/metaAttributes" ct:_="" ma:_="" ma:contentTypeName="Document" ma:contentTypeID="0x0101007D2747A40DF6534AA6DBE7745DD1D673" ma:contentTypeVersion="20" ma:contentTypeDescription="Create a new document." ma:contentTypeScope="" ma:versionID="69aed511600665433a4bc0874b3374cf">
   <xsd:schema xmlns:xsd="http://www.w3.org/2001/XMLSchema" xmlns:xs="http://www.w3.org/2001/XMLSchema" xmlns:p="http://schemas.microsoft.com/office/2006/metadata/properties" xmlns:ns2="2dd6ba2a-3947-4223-b8a9-da90adf2cba5" xmlns:ns3="20b13389-1085-4401-9aca-e940c1900e8d" targetNamespace="http://schemas.microsoft.com/office/2006/metadata/properties" ma:root="true" ma:fieldsID="d0b33c60f090f8534619f608cfaa76bd" ns2:_="" ns3:_="">
     <xsd:import namespace="2dd6ba2a-3947-4223-b8a9-da90adf2cba5"/>
@@ -25612,21 +25679,8 @@
 </ct:contentTypeSchema>
 </file>
 
-<file path=customXml/item3.xml><?xml version="1.0" encoding="utf-8"?>
+<file path=customXml/item4.xml><?xml version="1.0" encoding="utf-8"?>
 <b:Sources xmlns:b="http://schemas.openxmlformats.org/officeDocument/2006/bibliography" xmlns="http://schemas.openxmlformats.org/officeDocument/2006/bibliography" SelectedStyle="\CHICAGO.XSL" StyleName="Chicago"/>
-</file>
-
-<file path=customXml/item4.xml><?xml version="1.0" encoding="utf-8"?>
-<p:properties xmlns:p="http://schemas.microsoft.com/office/2006/metadata/properties" xmlns:xsi="http://www.w3.org/2001/XMLSchema-instance">
-  <documentManagement>
-    <Comments xmlns="2dd6ba2a-3947-4223-b8a9-da90adf2cba5" xsi:nil="true"/>
-    <lcf76f155ced4ddcb4097134ff3c332f xmlns="2dd6ba2a-3947-4223-b8a9-da90adf2cba5">
-      <Terms xmlns="http://schemas.microsoft.com/office/infopath/2007/PartnerControls"/>
-    </lcf76f155ced4ddcb4097134ff3c332f>
-    <_Flow_SignoffStatus xmlns="2dd6ba2a-3947-4223-b8a9-da90adf2cba5" xsi:nil="true"/>
-    <TaxCatchAll xmlns="20b13389-1085-4401-9aca-e940c1900e8d" xsi:nil="true"/>
-  </documentManagement>
-</p:properties>
 </file>
 
 <file path=customXml/itemProps1.xml><?xml version="1.0" encoding="utf-8"?>
@@ -25638,6 +25692,17 @@
 </file>
 
 <file path=customXml/itemProps2.xml><?xml version="1.0" encoding="utf-8"?>
+<ds:datastoreItem xmlns:ds="http://schemas.openxmlformats.org/officeDocument/2006/customXml" ds:itemID="{F6FC6BAA-F487-45E3-BE01-07C07BE62AF4}">
+  <ds:schemaRefs>
+    <ds:schemaRef ds:uri="http://schemas.microsoft.com/office/2006/metadata/properties"/>
+    <ds:schemaRef ds:uri="2dd6ba2a-3947-4223-b8a9-da90adf2cba5"/>
+    <ds:schemaRef ds:uri="http://schemas.microsoft.com/office/infopath/2007/PartnerControls"/>
+    <ds:schemaRef ds:uri="20b13389-1085-4401-9aca-e940c1900e8d"/>
+  </ds:schemaRefs>
+</ds:datastoreItem>
+</file>
+
+<file path=customXml/itemProps3.xml><?xml version="1.0" encoding="utf-8"?>
 <ds:datastoreItem xmlns:ds="http://schemas.openxmlformats.org/officeDocument/2006/customXml" ds:itemID="{0BB3E3EE-FD9A-411A-90AA-AAB4C66EBDE5}">
   <ds:schemaRefs>
     <ds:schemaRef ds:uri="http://schemas.microsoft.com/office/2006/metadata/contentType"/>
@@ -25656,21 +25721,10 @@
 </ds:datastoreItem>
 </file>
 
-<file path=customXml/itemProps3.xml><?xml version="1.0" encoding="utf-8"?>
+<file path=customXml/itemProps4.xml><?xml version="1.0" encoding="utf-8"?>
 <ds:datastoreItem xmlns:ds="http://schemas.openxmlformats.org/officeDocument/2006/customXml" ds:itemID="{5F61920D-B74D-4B58-BF31-6C1F3812E916}">
   <ds:schemaRefs>
     <ds:schemaRef ds:uri="http://schemas.openxmlformats.org/officeDocument/2006/bibliography"/>
   </ds:schemaRefs>
 </ds:datastoreItem>
-</file>
-
-<file path=customXml/itemProps4.xml><?xml version="1.0" encoding="utf-8"?>
-<ds:datastoreItem xmlns:ds="http://schemas.openxmlformats.org/officeDocument/2006/customXml" ds:itemID="{F6FC6BAA-F487-45E3-BE01-07C07BE62AF4}">
-  <ds:schemaRefs>
-    <ds:schemaRef ds:uri="http://schemas.microsoft.com/office/2006/metadata/properties"/>
-    <ds:schemaRef ds:uri="2dd6ba2a-3947-4223-b8a9-da90adf2cba5"/>
-    <ds:schemaRef ds:uri="http://schemas.microsoft.com/office/infopath/2007/PartnerControls"/>
-    <ds:schemaRef ds:uri="20b13389-1085-4401-9aca-e940c1900e8d"/>
-  </ds:schemaRefs>
-</ds:datastoreItem>
 </file>
</xml_diff>